<commit_message>
OFC: same plain-declarative style pass as WCNC (infocom exemplar)
Rewrote all prose: short sentences, no em-dashes in prose (SNDlib bib title keeps its
own), minimal italics, no label-speak ('first-class measured KPI', 'evidence rung',
'external-validity graduations' all gone). Abstract rewritten at 34/35 words. Captions
plain ('Two objectives, two metrics', 'Where the margin fails'). All sealed/deterministic
numbers, figures, and references unchanged; Rottondi/Pointurier '% verify' notes kept
(not yet verified). Preview tex/PDF/DOCX regenerated to match.

Co-Authored-By: Claude Opus 4.8 <noreply@anthropic.com>
</commit_message>
<xml_diff>
--- a/paper/ofc-qot/build/ofc-qot-preview.docx
+++ b/paper/ofc-qot/build/ofc-qot-preview.docx
@@ -58,122 +58,70 @@
         <w:pStyle w:val="FirstParagraph"/>
       </w:pPr>
       <w:r>
-        <w:t xml:space="preserve">Machine-learning Quality-of-Transmission (ML-QoT) estimation is a leading route to</w:t>
-      </w:r>
-      <w:r>
-        <w:t xml:space="preserve"> </w:t>
-      </w:r>
-      <w:r>
-        <w:t xml:space="preserve">reducing the system margin—the deliberately stranded capacity—that optical</w:t>
-      </w:r>
-      <w:r>
-        <w:t xml:space="preserve"> </w:t>
-      </w:r>
-      <w:r>
-        <w:t xml:space="preserve">operators carry against uncertain reach performance </w:t>
-      </w:r>
-      <w:r>
-        <w:t xml:space="preserve">. ML-QoT</w:t>
-      </w:r>
-      <w:r>
-        <w:t xml:space="preserve"> </w:t>
-      </w:r>
-      <w:r>
-        <w:t xml:space="preserve">models are almost always trained to minimise a</w:t>
-      </w:r>
-      <w:r>
-        <w:t xml:space="preserve"> </w:t>
-      </w:r>
-      <w:r>
-        <w:rPr>
-          <w:i/>
-          <w:iCs/>
-        </w:rPr>
-        <w:t xml:space="preserve">prediction error</w:t>
-      </w:r>
-      <w:r>
-        <w:t xml:space="preserve"> </w:t>
-      </w:r>
-      <w:r>
-        <w:t xml:space="preserve">(mean-squared</w:t>
-      </w:r>
-      <w:r>
-        <w:t xml:space="preserve"> </w:t>
-      </w:r>
-      <w:r>
-        <w:t xml:space="preserve">or mean-absolute GSNR/OSNR error). We argue, and measure, that this objective is</w:t>
-      </w:r>
-      <w:r>
-        <w:t xml:space="preserve"> </w:t>
-      </w:r>
-      <w:r>
-        <w:t xml:space="preserve">misaligned with the consumer it serves. The consumer of a QoT estimate is the</w:t>
-      </w:r>
-      <w:r>
-        <w:t xml:space="preserve"> </w:t>
-      </w:r>
-      <w:r>
-        <w:rPr>
-          <w:i/>
-          <w:iCs/>
-        </w:rPr>
-        <w:t xml:space="preserve">format-selection decision</w:t>
-      </w:r>
-      <w:r>
-        <w:t xml:space="preserve">, and ultimately the forward-error-correction (FEC)</w:t>
-      </w:r>
-      <w:r>
-        <w:t xml:space="preserve"> </w:t>
-      </w:r>
-      <w:r>
-        <w:t xml:space="preserve">decoder, which reads a</w:t>
-      </w:r>
-      <w:r>
-        <w:t xml:space="preserve"> </w:t>
-      </w:r>
-      <w:r>
-        <w:rPr>
-          <w:i/>
-          <w:iCs/>
-        </w:rPr>
-        <w:t xml:space="preserve">threshold</w:t>
-      </w:r>
-      <w:r>
-        <w:t xml:space="preserve">: a lightpath either meets its format’s</w:t>
-      </w:r>
-      <w:r>
-        <w:t xml:space="preserve"> </w:t>
-      </w:r>
-      <w:r>
-        <w:t xml:space="preserve">required GSNR or it does not. An estimator can be excellent on average yet, near a</w:t>
-      </w:r>
-      <w:r>
-        <w:t xml:space="preserve"> </w:t>
-      </w:r>
-      <w:r>
-        <w:t xml:space="preserve">format boundary, over-predict just enough to select a rate the link cannot support—</w:t>
-      </w:r>
-      <w:r>
-        <w:t xml:space="preserve"> </w:t>
-      </w:r>
-      <w:r>
-        <w:t xml:space="preserve">a</w:t>
-      </w:r>
-      <w:r>
-        <w:t xml:space="preserve"> </w:t>
-      </w:r>
-      <w:r>
-        <w:rPr>
-          <w:i/>
-          <w:iCs/>
-        </w:rPr>
-        <w:t xml:space="preserve">false-clear</w:t>
-      </w:r>
-      <w:r>
-        <w:t xml:space="preserve"> </w:t>
-      </w:r>
-      <w:r>
-        <w:t xml:space="preserve">(an in-service outage), even though its mean error is small.</w:t>
+        <w:t xml:space="preserve">Machine-learning quality-of-transmission (ML-QoT) estimation is a leading route to</w:t>
+      </w:r>
+      <w:r>
+        <w:t xml:space="preserve"> </w:t>
+      </w:r>
+      <w:r>
+        <w:t xml:space="preserve">reducing the system margin that optical operators carry against uncertain reach</w:t>
+      </w:r>
+      <w:r>
+        <w:t xml:space="preserve"> </w:t>
+      </w:r>
+      <w:r>
+        <w:t xml:space="preserve">performance </w:t>
+      </w:r>
+      <w:r>
+        <w:t xml:space="preserve">. That margin is deliberately stranded capacity, so</w:t>
+      </w:r>
+      <w:r>
+        <w:t xml:space="preserve"> </w:t>
+      </w:r>
+      <w:r>
+        <w:t xml:space="preserve">every fraction of a dB matters. ML-QoT models are almost always trained to minimise a</w:t>
+      </w:r>
+      <w:r>
+        <w:t xml:space="preserve"> </w:t>
+      </w:r>
+      <w:r>
+        <w:t xml:space="preserve">prediction error, mean-squared or mean-absolute GSNR error. We argue, and then</w:t>
+      </w:r>
+      <w:r>
+        <w:t xml:space="preserve"> </w:t>
+      </w:r>
+      <w:r>
+        <w:t xml:space="preserve">measure, that this objective serves the wrong master. The consumer of a QoT estimate</w:t>
+      </w:r>
+      <w:r>
+        <w:t xml:space="preserve"> </w:t>
+      </w:r>
+      <w:r>
+        <w:t xml:space="preserve">is the format-selection decision, and behind it the FEC decoder, and the decoder reads</w:t>
+      </w:r>
+      <w:r>
+        <w:t xml:space="preserve"> </w:t>
+      </w:r>
+      <w:r>
+        <w:t xml:space="preserve">a threshold. A lightpath either meets its format’s required GSNR or it does not. An</w:t>
+      </w:r>
+      <w:r>
+        <w:t xml:space="preserve"> </w:t>
+      </w:r>
+      <w:r>
+        <w:t xml:space="preserve">estimator can be excellent on average and still, near a format boundary, over-predict</w:t>
+      </w:r>
+      <w:r>
+        <w:t xml:space="preserve"> </w:t>
+      </w:r>
+      <w:r>
+        <w:t xml:space="preserve">by just enough to select a rate the link cannot support. The result is an in-service</w:t>
+      </w:r>
+      <w:r>
+        <w:t xml:space="preserve"> </w:t>
+      </w:r>
+      <w:r>
+        <w:t xml:space="preserve">outage even though the mean error was small. We call this a false-clear.</w:t>
       </w:r>
     </w:p>
     <w:p>
@@ -181,78 +129,37 @@
         <w:pStyle w:val="BodyText"/>
       </w:pPr>
       <w:r>
-        <w:t xml:space="preserve">We make the false-clear rate a first-class, measured KPI and show three things on the</w:t>
-      </w:r>
-      <w:r>
-        <w:t xml:space="preserve"> </w:t>
-      </w:r>
-      <w:r>
-        <w:t xml:space="preserve">GN-model physical layer of GNPy </w:t>
-      </w:r>
-      <w:r>
-        <w:t xml:space="preserve"> </w:t>
-      </w:r>
-      <w:r>
-        <w:t xml:space="preserve">over the CORONET-CONUS reference network:</w:t>
-      </w:r>
-      <w:r>
-        <w:t xml:space="preserve"> </w:t>
-      </w:r>
-      <w:r>
-        <w:t xml:space="preserve">(i) an average-error ML-QoT objective false-clears at the FEC cliff, while a</w:t>
-      </w:r>
-      <w:r>
-        <w:t xml:space="preserve"> </w:t>
-      </w:r>
-      <w:r>
-        <w:t xml:space="preserve">consumer-aware objective does not, at equal capacity; (ii) the underlying QoT margin</w:t>
-      </w:r>
-      <w:r>
-        <w:t xml:space="preserve"> </w:t>
-      </w:r>
-      <w:r>
-        <w:t xml:space="preserve">is</w:t>
-      </w:r>
-      <w:r>
-        <w:t xml:space="preserve"> </w:t>
-      </w:r>
-      <w:r>
-        <w:rPr>
-          <w:i/>
-          <w:iCs/>
-        </w:rPr>
-        <w:t xml:space="preserve">consumer-relative</w:t>
-      </w:r>
-      <w:r>
-        <w:t xml:space="preserve">—which lightpaths are at risk is a footprint property</w:t>
-      </w:r>
-      <w:r>
-        <w:t xml:space="preserve"> </w:t>
-      </w:r>
-      <w:r>
-        <w:t xml:space="preserve">(spectral position and reach), so no blanket margin fits all; and (iii) a</w:t>
-      </w:r>
-      <w:r>
-        <w:t xml:space="preserve"> </w:t>
-      </w:r>
-      <w:r>
-        <w:t xml:space="preserve">fill-driven</w:t>
-      </w:r>
-      <w:r>
-        <w:t xml:space="preserve"> </w:t>
-      </w:r>
-      <w:r>
-        <w:rPr>
-          <w:i/>
-          <w:iCs/>
-        </w:rPr>
-        <w:t xml:space="preserve">refresh floor</w:t>
-      </w:r>
-      <w:r>
-        <w:t xml:space="preserve"> </w:t>
-      </w:r>
-      <w:r>
-        <w:t xml:space="preserve">sets when a certificate must be re-validated.</w:t>
+        <w:t xml:space="preserve">We measure the false-clear rate on the GN-model physical layer of GNPy </w:t>
+      </w:r>
+      <w:r>
+        <w:t xml:space="preserve"> </w:t>
+      </w:r>
+      <w:r>
+        <w:t xml:space="preserve">over the CORONET-CONUS reference network and show three things. An average-error</w:t>
+      </w:r>
+      <w:r>
+        <w:t xml:space="preserve"> </w:t>
+      </w:r>
+      <w:r>
+        <w:t xml:space="preserve">ML-QoT objective false-clears at the FEC cliff while a threshold-aware objective does</w:t>
+      </w:r>
+      <w:r>
+        <w:t xml:space="preserve"> </w:t>
+      </w:r>
+      <w:r>
+        <w:t xml:space="preserve">not, at equal capacity. Which lightpaths are at risk is set by spectral position and</w:t>
+      </w:r>
+      <w:r>
+        <w:t xml:space="preserve"> </w:t>
+      </w:r>
+      <w:r>
+        <w:t xml:space="preserve">reach, so no single blanket margin fits all of them. And the risk grows with the fill</w:t>
+      </w:r>
+      <w:r>
+        <w:t xml:space="preserve"> </w:t>
+      </w:r>
+      <w:r>
+        <w:t xml:space="preserve">added after provisioning, which gives the certificate a refresh horizon.</w:t>
       </w:r>
     </w:p>
     <w:bookmarkEnd w:id="9"/>
@@ -286,60 +193,36 @@
         <w:t xml:space="preserve"> </w:t>
       </w:r>
       <w:r>
-        <w:rPr>
-          <w:b/>
-          <w:bCs/>
-        </w:rPr>
-        <w:t xml:space="preserve">CORONET-CONUS</w:t>
-      </w:r>
-      <w:r>
-        <w:t xml:space="preserve"> </w:t>
-      </w:r>
-      <w:r>
-        <w:t xml:space="preserve">reference topology (75 nodes;</w:t>
+        <w:t xml:space="preserve">CORONET-CONUS reference topology (75 nodes; up to</w:t>
       </w:r>
       <w:r>
         <w:t xml:space="preserve"> </w:t>
       </w:r>
       <m:oMath>
         <m:r>
-          <m:rPr>
-            <m:sty m:val="p"/>
-          </m:rPr>
-          <m:t>≤</m:t>
-        </m:r>
-        <m:r>
           <m:t>2500</m:t>
         </m:r>
       </m:oMath>
       <w:r>
-        <w:t xml:space="preserve"> km, 2–31</w:t>
-      </w:r>
-      <m:oMath>
-        <m:r>
-          <m:rPr>
-            <m:sty m:val="p"/>
-          </m:rPr>
-          <m:t>×</m:t>
-        </m:r>
-      </m:oMath>
-      <w:r>
-        <w:t xml:space="preserve"> </w:t>
-      </w:r>
-      <w:r>
-        <w:t xml:space="preserve">80 km spans). Per-channel GSNR is computed with the GN model in GNPy </w:t>
-      </w:r>
-      <w:r>
-        <w:t xml:space="preserve"> </w:t>
-      </w:r>
-      <w:r>
-        <w:t xml:space="preserve">on</w:t>
-      </w:r>
-      <w:r>
-        <w:t xml:space="preserve"> </w:t>
-      </w:r>
-      <w:r>
-        <w:t xml:space="preserve">standard single-mode fibre (0.2 dB/km,</w:t>
+        <w:t xml:space="preserve"> km, 2–31 spans of</w:t>
+      </w:r>
+      <w:r>
+        <w:t xml:space="preserve"> </w:t>
+      </w:r>
+      <w:r>
+        <w:t xml:space="preserve">80 km). Per-channel GSNR comes from the GN model in GNPy </w:t>
+      </w:r>
+      <w:r>
+        <w:t xml:space="preserve"> </w:t>
+      </w:r>
+      <w:r>
+        <w:t xml:space="preserve">on standard</w:t>
+      </w:r>
+      <w:r>
+        <w:t xml:space="preserve"> </w:t>
+      </w:r>
+      <w:r>
+        <w:t xml:space="preserve">single-mode fibre (0.2 dB/km,</w:t>
       </w:r>
       <w:r>
         <w:t xml:space="preserve"> </w:t>
@@ -359,31 +242,36 @@
         </m:r>
       </m:oMath>
       <w:r>
-        <w:t xml:space="preserve"> ps/nm/km), EDFAs (NF 6 dB),</w:t>
-      </w:r>
-      <w:r>
-        <w:t xml:space="preserve"> </w:t>
-      </w:r>
-      <w:r>
-        <w:t xml:space="preserve">+2 dBm/ch, 32 GBd, 50 GHz grid, from a lightly filled</w:t>
-      </w:r>
-      <w:r>
-        <w:t xml:space="preserve"> </w:t>
-      </w:r>
-      <w:r>
-        <w:t xml:space="preserve">“provisioning”</w:t>
-      </w:r>
-      <w:r>
-        <w:t xml:space="preserve"> </w:t>
-      </w:r>
-      <w:r>
-        <w:t xml:space="preserve">band</w:t>
-      </w:r>
-      <w:r>
-        <w:t xml:space="preserve"> </w:t>
-      </w:r>
-      <w:r>
-        <w:t xml:space="preserve">(6 channels) to a full C-band (76 channels).</w:t>
+        <w:t xml:space="preserve"> ps/nm/km) with 6 dB-NF EDFAs,</w:t>
+      </w:r>
+      <w:r>
+        <w:t xml:space="preserve"> </w:t>
+      </w:r>
+      <m:oMath>
+        <m:r>
+          <m:rPr>
+            <m:sty m:val="p"/>
+          </m:rPr>
+          <m:t>+</m:t>
+        </m:r>
+        <m:r>
+          <m:t>2</m:t>
+        </m:r>
+      </m:oMath>
+      <w:r>
+        <w:t xml:space="preserve"> dBm per</w:t>
+      </w:r>
+      <w:r>
+        <w:t xml:space="preserve"> </w:t>
+      </w:r>
+      <w:r>
+        <w:t xml:space="preserve">channel, 32 GBd on a 50 GHz grid. The band runs from a lightly filled provisioning</w:t>
+      </w:r>
+      <w:r>
+        <w:t xml:space="preserve"> </w:t>
+      </w:r>
+      <w:r>
+        <w:t xml:space="preserve">state of 6 channels to a full C-band of 76.</w:t>
       </w:r>
     </w:p>
     <w:p>
@@ -407,101 +295,49 @@
         <w:t xml:space="preserve"> </w:t>
       </w:r>
       <w:r>
-        <w:t xml:space="preserve">whose required GSNR the estimate clears. The</w:t>
-      </w:r>
-      <w:r>
-        <w:t xml:space="preserve"> </w:t>
-      </w:r>
-      <w:r>
-        <w:rPr>
-          <w:i/>
-          <w:iCs/>
-        </w:rPr>
-        <w:t xml:space="preserve">consumer</w:t>
-      </w:r>
-      <w:r>
-        <w:t xml:space="preserve"> </w:t>
-      </w:r>
-      <w:r>
-        <w:t xml:space="preserve">is that decision; the</w:t>
-      </w:r>
-      <w:r>
-        <w:t xml:space="preserve"> </w:t>
-      </w:r>
-      <w:r>
-        <w:rPr>
-          <w:i/>
-          <w:iCs/>
-        </w:rPr>
-        <w:t xml:space="preserve">witness</w:t>
-      </w:r>
-      <w:r>
-        <w:t xml:space="preserve"> </w:t>
-      </w:r>
-      <w:r>
-        <w:t xml:space="preserve">is the true deployed GSNR (the receiver’s pre-FEC BER). For the ML</w:t>
-      </w:r>
-      <w:r>
-        <w:t xml:space="preserve"> </w:t>
-      </w:r>
-      <w:r>
-        <w:t xml:space="preserve">study, features are provisioning-time GSNR and (spectral position, reach, fill), the</w:t>
-      </w:r>
-      <w:r>
-        <w:t xml:space="preserve"> </w:t>
-      </w:r>
-      <w:r>
-        <w:t xml:space="preserve">label carries an irreducible unmeasured-state term, and two gradient-boosted</w:t>
-      </w:r>
-      <w:r>
-        <w:t xml:space="preserve"> </w:t>
-      </w:r>
-      <w:r>
-        <w:t xml:space="preserve">objectives are compared:</w:t>
-      </w:r>
-      <w:r>
-        <w:t xml:space="preserve"> </w:t>
-      </w:r>
-      <w:r>
-        <w:rPr>
-          <w:i/>
-          <w:iCs/>
-        </w:rPr>
-        <w:t xml:space="preserve">average-error</w:t>
-      </w:r>
-      <w:r>
-        <w:t xml:space="preserve"> </w:t>
-      </w:r>
-      <w:r>
-        <w:t xml:space="preserve">(squared loss) and</w:t>
-      </w:r>
-      <w:r>
-        <w:t xml:space="preserve"> </w:t>
-      </w:r>
-      <w:r>
-        <w:rPr>
-          <w:i/>
-          <w:iCs/>
-        </w:rPr>
-        <w:t xml:space="preserve">consumer-aware</w:t>
-      </w:r>
-      <w:r>
-        <w:t xml:space="preserve"> </w:t>
-      </w:r>
-      <w:r>
-        <w:t xml:space="preserve">(a conservative lower-quantile loss that protects the decision, not the mean). Bars</w:t>
-      </w:r>
-      <w:r>
-        <w:t xml:space="preserve"> </w:t>
-      </w:r>
-      <w:r>
-        <w:t xml:space="preserve">and manipulation checks are pre-registered; the sealed record is content-hashed with</w:t>
-      </w:r>
-      <w:r>
-        <w:t xml:space="preserve"> </w:t>
-      </w:r>
-      <w:r>
-        <w:t xml:space="preserve">disjoint graded seeds </w:t>
+        <w:t xml:space="preserve">whose required GSNR the estimate clears. The consumer is that decision. The witness is</w:t>
+      </w:r>
+      <w:r>
+        <w:t xml:space="preserve"> </w:t>
+      </w:r>
+      <w:r>
+        <w:t xml:space="preserve">the true deployed GSNR, in practice the receiver’s pre-FEC BER. For the ML study the</w:t>
+      </w:r>
+      <w:r>
+        <w:t xml:space="preserve"> </w:t>
+      </w:r>
+      <w:r>
+        <w:t xml:space="preserve">features are the provisioning-time GSNR plus spectral position, reach and fill, the</w:t>
+      </w:r>
+      <w:r>
+        <w:t xml:space="preserve"> </w:t>
+      </w:r>
+      <w:r>
+        <w:t xml:space="preserve">label carries an irreducible term for unmeasured network state, and two</w:t>
+      </w:r>
+      <w:r>
+        <w:t xml:space="preserve"> </w:t>
+      </w:r>
+      <w:r>
+        <w:t xml:space="preserve">gradient-boosted objectives compete: average-error (squared loss) and consumer-aware</w:t>
+      </w:r>
+      <w:r>
+        <w:t xml:space="preserve"> </w:t>
+      </w:r>
+      <w:r>
+        <w:t xml:space="preserve">(a conservative lower-quantile loss that protects the decision rather than the mean).</w:t>
+      </w:r>
+      <w:r>
+        <w:t xml:space="preserve"> </w:t>
+      </w:r>
+      <w:r>
+        <w:t xml:space="preserve">Bars and manipulation checks are pre-registered. The sealed record is content-hashed</w:t>
+      </w:r>
+      <w:r>
+        <w:t xml:space="preserve"> </w:t>
+      </w:r>
+      <w:r>
+        <w:t xml:space="preserve">and graded on seeds disjoint from those used during design </w:t>
       </w:r>
       <w:r>
         <w:t xml:space="preserve">.</w:t>
@@ -531,19 +367,13 @@
         <w:pStyle w:val="FirstParagraph"/>
       </w:pPr>
       <w:r>
-        <w:t xml:space="preserve">Under irreducible prediction uncertainty, the average-error estimator attains lower</w:t>
-      </w:r>
-      <w:r>
-        <w:t xml:space="preserve"> </w:t>
-      </w:r>
-      <w:r>
-        <w:t xml:space="preserve">mean error yet false-clears far more at the FEC cliff than the consumer-aware</w:t>
-      </w:r>
-      <w:r>
-        <w:t xml:space="preserve"> </w:t>
-      </w:r>
-      <w:r>
-        <w:t xml:space="preserve">objective: MAE</w:t>
+        <w:t xml:space="preserve">Under irreducible prediction uncertainty the average-error estimator wins the metric</w:t>
+      </w:r>
+      <w:r>
+        <w:t xml:space="preserve"> </w:t>
+      </w:r>
+      <w:r>
+        <w:t xml:space="preserve">it was trained on and loses the one that matters. Its MAE is</w:t>
       </w:r>
       <w:r>
         <w:t xml:space="preserve"> </w:t>
@@ -554,10 +384,7 @@
         </m:r>
       </m:oMath>
       <w:r>
-        <w:t xml:space="preserve"> </w:t>
-      </w:r>
-      <w:r>
-        <w:t xml:space="preserve">vs</w:t>
+        <w:t xml:space="preserve"> dB against</w:t>
       </w:r>
       <w:r>
         <w:t xml:space="preserve"> </w:t>
@@ -568,19 +395,13 @@
         </m:r>
       </m:oMath>
       <w:r>
-        <w:t xml:space="preserve"> dB (it wins reconstruction) but false-clear</w:t>
+        <w:t xml:space="preserve"> dB for the consumer-aware objective, yet its false-clear rate is about</w:t>
       </w:r>
       <w:r>
         <w:t xml:space="preserve"> </w:t>
       </w:r>
       <m:oMath>
         <m:r>
-          <m:rPr>
-            <m:sty m:val="p"/>
-          </m:rPr>
-          <m:t>≈</m:t>
-        </m:r>
-        <m:r>
           <m:t>0.041</m:t>
         </m:r>
       </m:oMath>
@@ -588,69 +409,35 @@
         <w:t xml:space="preserve"> </w:t>
       </w:r>
       <w:r>
-        <w:t xml:space="preserve">vs</w:t>
+        <w:t xml:space="preserve">against</w:t>
       </w:r>
       <w:r>
         <w:t xml:space="preserve"> </w:t>
       </w:r>
       <m:oMath>
         <m:r>
-          <m:rPr>
-            <m:sty m:val="p"/>
-          </m:rPr>
-          <m:t>≈</m:t>
-        </m:r>
-        <m:r>
           <m:t>0.008</m:t>
         </m:r>
       </m:oMath>
       <w:r>
-        <w:t xml:space="preserve"> </w:t>
-      </w:r>
-      <w:r>
-        <w:t xml:space="preserve">(</w:t>
+        <w:t xml:space="preserve">, five times higher, at comparable delivered spectral</w:t>
+      </w:r>
+      <w:r>
+        <w:t xml:space="preserve"> </w:t>
+      </w:r>
+      <w:r>
+        <w:t xml:space="preserve">efficiency near</w:t>
+      </w:r>
+      <w:r>
+        <w:t xml:space="preserve"> </w:t>
       </w:r>
       <m:oMath>
         <m:r>
-          <m:rPr>
-            <m:sty m:val="p"/>
-          </m:rPr>
-          <m:t>∼</m:t>
+          <m:t>3.9</m:t>
         </m:r>
       </m:oMath>
       <w:r>
-        <w:t xml:space="preserve">5</w:t>
-      </w:r>
-      <m:oMath>
-        <m:r>
-          <m:rPr>
-            <m:sty m:val="p"/>
-          </m:rPr>
-          <m:t>×</m:t>
-        </m:r>
-      </m:oMath>
-      <w:r>
-        <w:t xml:space="preserve">) at comparable delivered spectral</w:t>
-      </w:r>
-      <w:r>
-        <w:t xml:space="preserve"> </w:t>
-      </w:r>
-      <w:r>
-        <w:t xml:space="preserve">efficiency (</w:t>
-      </w:r>
-      <m:oMath>
-        <m:r>
-          <m:rPr>
-            <m:sty m:val="p"/>
-          </m:rPr>
-          <m:t>≈</m:t>
-        </m:r>
-        <m:r>
-          <m:t>3.9</m:t>
-        </m:r>
-      </m:oMath>
-      <w:r>
-        <w:t xml:space="preserve"> bits/symbol). Figure </w:t>
+        <w:t xml:space="preserve"> bits/symbol. Figure </w:t>
       </w:r>
       <w:hyperlink w:anchor="fig:ml">
         <w:r>
@@ -661,37 +448,48 @@
         </w:r>
       </w:hyperlink>
       <w:r>
-        <w:t xml:space="preserve">(a) shows the</w:t>
-      </w:r>
-      <w:r>
-        <w:t xml:space="preserve"> </w:t>
-      </w:r>
-      <w:r>
-        <w:t xml:space="preserve">reconstruction-vs-consumer dissociation; (b) shows that the average-error</w:t>
-      </w:r>
-      <w:r>
-        <w:t xml:space="preserve"> </w:t>
-      </w:r>
-      <w:r>
-        <w:t xml:space="preserve">false-clears concentrate where the GSNR headroom above the nearest format threshold</w:t>
-      </w:r>
-      <w:r>
-        <w:t xml:space="preserve"> </w:t>
-      </w:r>
-      <w:r>
-        <w:t xml:space="preserve">is small—the cliff—exactly where a symmetric error metric is blind. The</w:t>
-      </w:r>
-      <w:r>
-        <w:t xml:space="preserve"> </w:t>
-      </w:r>
-      <w:r>
-        <w:t xml:space="preserve">prescription is to train ML-QoT on the consumer’s threshold decision, not on</w:t>
-      </w:r>
-      <w:r>
-        <w:t xml:space="preserve"> </w:t>
-      </w:r>
-      <w:r>
-        <w:t xml:space="preserve">volume-averaged fidelity.</w:t>
+        <w:t xml:space="preserve">(a) shows the two objectives</w:t>
+      </w:r>
+      <w:r>
+        <w:t xml:space="preserve"> </w:t>
+      </w:r>
+      <w:r>
+        <w:t xml:space="preserve">trading places between the two metrics. Figure </w:t>
+      </w:r>
+      <w:hyperlink w:anchor="fig:ml">
+        <w:r>
+          <w:rPr>
+            <w:rStyle w:val="Hyperlink"/>
+          </w:rPr>
+          <w:t xml:space="preserve">1</w:t>
+        </w:r>
+      </w:hyperlink>
+      <w:r>
+        <w:t xml:space="preserve">(b) shows where the</w:t>
+      </w:r>
+      <w:r>
+        <w:t xml:space="preserve"> </w:t>
+      </w:r>
+      <w:r>
+        <w:t xml:space="preserve">failures live: the average-error false-clears concentrate where the GSNR headroom</w:t>
+      </w:r>
+      <w:r>
+        <w:t xml:space="preserve"> </w:t>
+      </w:r>
+      <w:r>
+        <w:t xml:space="preserve">above the nearest format threshold is small. That is the cliff, and it is exactly</w:t>
+      </w:r>
+      <w:r>
+        <w:t xml:space="preserve"> </w:t>
+      </w:r>
+      <w:r>
+        <w:t xml:space="preserve">where a symmetric error metric is blind. The fix is to train ML-QoT on the consumer’s</w:t>
+      </w:r>
+      <w:r>
+        <w:t xml:space="preserve"> </w:t>
+      </w:r>
+      <w:r>
+        <w:t xml:space="preserve">threshold decision rather than on volume-averaged fidelity.</w:t>
       </w:r>
     </w:p>
     <w:bookmarkStart w:id="14" w:name="fig:ml"/>
@@ -747,31 +545,25 @@
         <w:pStyle w:val="ImageCaption"/>
       </w:pPr>
       <w:r>
-        <w:t xml:space="preserve">ML-QoT reconstruction-vs-consumer dissociation (GNPy + gradient-boosted</w:t>
-      </w:r>
-      <w:r>
-        <w:t xml:space="preserve"> </w:t>
-      </w:r>
-      <w:r>
-        <w:t xml:space="preserve">regressors): (a) the average-error objective attains lower MAE yet higher</w:t>
-      </w:r>
-      <w:r>
-        <w:t xml:space="preserve"> </w:t>
-      </w:r>
-      <w:r>
-        <w:t xml:space="preserve">false-clear than the consumer-aware objective; (b) it false-clears at the FEC cliff</w:t>
-      </w:r>
-      <w:r>
-        <w:t xml:space="preserve"> </w:t>
-      </w:r>
-      <w:r>
-        <w:t xml:space="preserve">(small GSNR headroom), where the consumer-aware objective does not. Marker shape</w:t>
-      </w:r>
-      <w:r>
-        <w:t xml:space="preserve"> </w:t>
-      </w:r>
-      <w:r>
-        <w:t xml:space="preserve">distinguishes objectives.</w:t>
+        <w:t xml:space="preserve">Two objectives, two metrics (GNPy, gradient-boosted regressors). (a) The</w:t>
+      </w:r>
+      <w:r>
+        <w:t xml:space="preserve"> </w:t>
+      </w:r>
+      <w:r>
+        <w:t xml:space="preserve">average-error objective has lower MAE and higher false-clear than the consumer-aware</w:t>
+      </w:r>
+      <w:r>
+        <w:t xml:space="preserve"> </w:t>
+      </w:r>
+      <w:r>
+        <w:t xml:space="preserve">objective. (b) Its false-clears sit at the FEC cliff, where headroom is small.</w:t>
+      </w:r>
+      <w:r>
+        <w:t xml:space="preserve"> </w:t>
+      </w:r>
+      <w:r>
+        <w:t xml:space="preserve">Marker shape distinguishes objectives.</w:t>
       </w:r>
     </w:p>
     <w:bookmarkEnd w:id="14"/>
@@ -790,44 +582,31 @@
         <w:pStyle w:val="FirstParagraph"/>
       </w:pPr>
       <w:r>
-        <w:t xml:space="preserve">The same threshold-blindness afflicts the margin itself under incremental fill. As a</w:t>
-      </w:r>
-      <w:r>
-        <w:t xml:space="preserve"> </w:t>
-      </w:r>
-      <w:r>
-        <w:t xml:space="preserve">lightpath’s band fills toward its deployed load, its GSNR drops, and whether it</w:t>
-      </w:r>
-      <w:r>
-        <w:t xml:space="preserve"> </w:t>
-      </w:r>
-      <w:r>
-        <w:t xml:space="preserve">crosses a format threshold depends on its</w:t>
-      </w:r>
-      <w:r>
-        <w:t xml:space="preserve"> </w:t>
-      </w:r>
-      <w:r>
-        <w:rPr>
-          <w:i/>
-          <w:iCs/>
-        </w:rPr>
-        <w:t xml:space="preserve">footprint</w:t>
-      </w:r>
-      <w:r>
-        <w:t xml:space="preserve">: false-clears concentrate</w:t>
-      </w:r>
-      <w:r>
-        <w:t xml:space="preserve"> </w:t>
-      </w:r>
-      <w:r>
-        <w:t xml:space="preserve">on the services whose spectral position and reach place their GSNR nearest a boundary,</w:t>
-      </w:r>
-      <w:r>
-        <w:t xml:space="preserve"> </w:t>
-      </w:r>
-      <w:r>
-        <w:t xml:space="preserve">and are absent elsewhere (Fig. </w:t>
+        <w:t xml:space="preserve">The same threshold-blindness afflicts the margin itself as the band fills. A</w:t>
+      </w:r>
+      <w:r>
+        <w:t xml:space="preserve"> </w:t>
+      </w:r>
+      <w:r>
+        <w:t xml:space="preserve">lightpath’s GSNR drops as neighbours arrive, and whether it crosses a format threshold</w:t>
+      </w:r>
+      <w:r>
+        <w:t xml:space="preserve"> </w:t>
+      </w:r>
+      <w:r>
+        <w:t xml:space="preserve">depends on where it sits: false-clears concentrate on services whose spectral position</w:t>
+      </w:r>
+      <w:r>
+        <w:t xml:space="preserve"> </w:t>
+      </w:r>
+      <w:r>
+        <w:t xml:space="preserve">and reach leave their GSNR near a boundary, and are absent elsewhere</w:t>
+      </w:r>
+      <w:r>
+        <w:t xml:space="preserve"> </w:t>
+      </w:r>
+      <w:r>
+        <w:t xml:space="preserve">(Fig. </w:t>
       </w:r>
       <w:hyperlink w:anchor="fig:fc">
         <w:r>
@@ -838,127 +617,83 @@
         </w:r>
       </w:hyperlink>
       <w:r>
-        <w:t xml:space="preserve">). Consequently a single blanket margin</w:t>
-      </w:r>
-      <w:r>
-        <w:t xml:space="preserve"> </w:t>
-      </w:r>
-      <w:r>
-        <w:t xml:space="preserve">cannot be right for all. We quantify the cost against today’s practice—one</w:t>
-      </w:r>
-      <w:r>
-        <w:t xml:space="preserve"> </w:t>
-      </w:r>
-      <w:r>
-        <w:rPr>
-          <w:i/>
-          <w:iCs/>
-        </w:rPr>
-        <w:t xml:space="preserve">uniform</w:t>
-      </w:r>
-      <w:r>
-        <w:t xml:space="preserve"> </w:t>
-      </w:r>
-      <w:r>
-        <w:t xml:space="preserve">system margin sized so the fleet stays safe—using</w:t>
-      </w:r>
-      <w:r>
-        <w:t xml:space="preserve"> </w:t>
-      </w:r>
-      <w:r>
-        <w:rPr>
-          <w:i/>
-          <w:iCs/>
-        </w:rPr>
-        <w:t xml:space="preserve">real</w:t>
-      </w:r>
-      <w:r>
-        <w:t xml:space="preserve"> </w:t>
-      </w:r>
-      <w:r>
-        <w:t xml:space="preserve">deployed fill: each lightpath’s channel load is drawn from the per-link fill</w:t>
-      </w:r>
-      <w:r>
-        <w:t xml:space="preserve"> </w:t>
-      </w:r>
-      <w:r>
-        <w:t xml:space="preserve">distribution of the SNDlib</w:t>
-      </w:r>
-      <w:r>
-        <w:t xml:space="preserve"> </w:t>
-      </w:r>
-      <w:r>
-        <w:rPr>
-          <w:b/>
-          <w:bCs/>
-        </w:rPr>
-        <w:t xml:space="preserve">janos-us-ca</w:t>
-      </w:r>
-      <w:r>
-        <w:t xml:space="preserve"> </w:t>
-      </w:r>
-      <w:r>
-        <w:t xml:space="preserve">demand matrix (61 links; median 10,</w:t>
-      </w:r>
-      <w:r>
-        <w:t xml:space="preserve"> </w:t>
-      </w:r>
-      <w:r>
-        <w:t xml:space="preserve">90th-percentile 35 of 76 channels </w:t>
-      </w:r>
-      <w:r>
-        <w:t xml:space="preserve">). Real traffic is heavy-tailed, so a</w:t>
-      </w:r>
-      <w:r>
-        <w:t xml:space="preserve"> </w:t>
-      </w:r>
-      <w:r>
-        <w:t xml:space="preserve">uniform margin sized for the few near-full links over-provisions the lightly-filled</w:t>
-      </w:r>
-      <w:r>
-        <w:t xml:space="preserve"> </w:t>
-      </w:r>
-      <w:r>
-        <w:t xml:space="preserve">majority. Giving</w:t>
-      </w:r>
-      <w:r>
-        <w:t xml:space="preserve"> </w:t>
-      </w:r>
-      <w:r>
-        <w:rPr>
-          <w:i/>
-          <w:iCs/>
-        </w:rPr>
-        <w:t xml:space="preserve">both</w:t>
-      </w:r>
-      <w:r>
-        <w:t xml:space="preserve"> </w:t>
-      </w:r>
-      <w:r>
-        <w:t xml:space="preserve">policies the same QoT-estimator uncertainty (0.5 dB</w:t>
-      </w:r>
-      <w:r>
-        <w:t xml:space="preserve"> </w:t>
-      </w:r>
-      <w:r>
-        <w:t xml:space="preserve">RMSE, so the footprint-aware certificate is not assumed perfect), a certificate that</w:t>
-      </w:r>
-      <w:r>
-        <w:t xml:space="preserve"> </w:t>
-      </w:r>
-      <w:r>
-        <w:t xml:space="preserve">sizes each margin to the lightpath’s own fill recovers</w:t>
+        <w:t xml:space="preserve">). So a single blanket margin cannot be right for every lightpath.</w:t>
+      </w:r>
+      <w:r>
+        <w:t xml:space="preserve"> </w:t>
+      </w:r>
+      <w:r>
+        <w:t xml:space="preserve">We price this against today’s practice of one uniform system margin sized to keep the</w:t>
+      </w:r>
+      <w:r>
+        <w:t xml:space="preserve"> </w:t>
+      </w:r>
+      <w:r>
+        <w:t xml:space="preserve">whole fleet safe. The deployed fill is real. Each lightpath’s channel load is drawn</w:t>
+      </w:r>
+      <w:r>
+        <w:t xml:space="preserve"> </w:t>
+      </w:r>
+      <w:r>
+        <w:t xml:space="preserve">from the per-link fill distribution of the SNDlib janos-us-ca demand</w:t>
+      </w:r>
+      <w:r>
+        <w:t xml:space="preserve"> </w:t>
+      </w:r>
+      <w:r>
+        <w:t xml:space="preserve">matrix </w:t>
+      </w:r>
+      <w:r>
+        <w:t xml:space="preserve"> </w:t>
+      </w:r>
+      <w:r>
+        <w:t xml:space="preserve">(61 links; median 10 channels, 90th percentile 35, of 76). Real</w:t>
+      </w:r>
+      <w:r>
+        <w:t xml:space="preserve"> </w:t>
+      </w:r>
+      <w:r>
+        <w:t xml:space="preserve">traffic is heavy-tailed. A uniform margin sized for the few near-full links</w:t>
+      </w:r>
+      <w:r>
+        <w:t xml:space="preserve"> </w:t>
+      </w:r>
+      <w:r>
+        <w:t xml:space="preserve">over-provisions the lightly filled majority. We give both policies the same</w:t>
+      </w:r>
+      <w:r>
+        <w:t xml:space="preserve"> </w:t>
+      </w:r>
+      <w:r>
+        <w:t xml:space="preserve">QoT-estimator uncertainty of</w:t>
       </w:r>
       <w:r>
         <w:t xml:space="preserve"> </w:t>
       </w:r>
       <m:oMath>
         <m:r>
-          <m:rPr>
-            <m:sty m:val="p"/>
-          </m:rPr>
-          <m:t>≈</m:t>
-        </m:r>
+          <m:t>0.5</m:t>
+        </m:r>
+      </m:oMath>
+      <w:r>
+        <w:t xml:space="preserve"> dB RMSE, so the footprint-aware certificate is</w:t>
+      </w:r>
+      <w:r>
+        <w:t xml:space="preserve"> </w:t>
+      </w:r>
+      <w:r>
+        <w:t xml:space="preserve">not assumed perfect. Sizing each margin to the lightpath’s own fill then recovers</w:t>
+      </w:r>
+      <w:r>
+        <w:t xml:space="preserve"> </w:t>
+      </w:r>
+      <w:r>
+        <w:t xml:space="preserve">about</w:t>
+      </w:r>
+      <w:r>
+        <w:t xml:space="preserve"> </w:t>
+      </w:r>
+      <m:oMath>
         <m:r>
           <m:t>8</m:t>
         </m:r>
@@ -973,70 +708,52 @@
         <w:t xml:space="preserve"> </w:t>
       </w:r>
       <w:r>
-        <w:t xml:space="preserve">of spectral</w:t>
-      </w:r>
-      <w:r>
-        <w:t xml:space="preserve"> </w:t>
-      </w:r>
-      <w:r>
-        <w:t xml:space="preserve">efficiency (</w:t>
+        <w:t xml:space="preserve">of spectral efficiency, near</w:t>
+      </w:r>
+      <w:r>
+        <w:t xml:space="preserve"> </w:t>
       </w:r>
       <m:oMath>
         <m:r>
-          <m:rPr>
-            <m:sty m:val="p"/>
-          </m:rPr>
-          <m:t>≈</m:t>
-        </m:r>
-        <m:r>
           <m:t>0.33</m:t>
         </m:r>
       </m:oMath>
       <w:r>
-        <w:t xml:space="preserve"> b/sym,</w:t>
+        <w:t xml:space="preserve"> b/sym or</w:t>
       </w:r>
       <w:r>
         <w:t xml:space="preserve"> </w:t>
       </w:r>
       <m:oMath>
         <m:r>
-          <m:rPr>
-            <m:sty m:val="p"/>
-          </m:rPr>
-          <m:t>∼</m:t>
+          <m:t>21</m:t>
         </m:r>
       </m:oMath>
       <w:r>
-        <w:t xml:space="preserve">21 Gb/s per channel) at matched safety</w:t>
-      </w:r>
-      <w:r>
-        <w:t xml:space="preserve"> </w:t>
-      </w:r>
-      <w:r>
-        <w:t xml:space="preserve">(false-clear</w:t>
+        <w:t xml:space="preserve"> Gb/s per channel, at</w:t>
+      </w:r>
+      <w:r>
+        <w:t xml:space="preserve"> </w:t>
+      </w:r>
+      <w:r>
+        <w:t xml:space="preserve">matched safety (false-clear at most</w:t>
       </w:r>
       <w:r>
         <w:t xml:space="preserve"> </w:t>
       </w:r>
       <m:oMath>
         <m:r>
-          <m:rPr>
-            <m:sty m:val="p"/>
-          </m:rPr>
-          <m:t>≤</m:t>
-        </m:r>
-        <m:r>
           <m:t>0.01</m:t>
         </m:r>
       </m:oMath>
       <w:r>
-        <w:t xml:space="preserve">), on a rate-flexible transceiver model. The gain is modest</w:t>
-      </w:r>
-      <w:r>
-        <w:t xml:space="preserve"> </w:t>
-      </w:r>
-      <w:r>
-        <w:t xml:space="preserve">but free: it is capacity the uniform margin strands on the majority of links that</w:t>
+        <w:t xml:space="preserve">) on a rate-flexible transceiver model. The</w:t>
+      </w:r>
+      <w:r>
+        <w:t xml:space="preserve"> </w:t>
+      </w:r>
+      <w:r>
+        <w:t xml:space="preserve">gain is modest and free. It is capacity the uniform margin strands on links that</w:t>
       </w:r>
       <w:r>
         <w:t xml:space="preserve"> </w:t>
@@ -1098,25 +815,19 @@
         <w:pStyle w:val="ImageCaption"/>
       </w:pPr>
       <w:r>
-        <w:t xml:space="preserve">Consumer-relativity of the QoT margin on GNPy over CORONET-CONUS:</w:t>
-      </w:r>
-      <w:r>
-        <w:t xml:space="preserve"> </w:t>
-      </w:r>
-      <w:r>
-        <w:t xml:space="preserve">per-service false-clear over (spectral position, reach) concentrates on</w:t>
-      </w:r>
-      <w:r>
-        <w:t xml:space="preserve"> </w:t>
-      </w:r>
-      <w:r>
-        <w:t xml:space="preserve">threshold-adjacent services; a footprint-aware certificate removes it. Marker</w:t>
-      </w:r>
-      <w:r>
-        <w:t xml:space="preserve"> </w:t>
-      </w:r>
-      <w:r>
-        <w:t xml:space="preserve">shape distinguishes classes.</w:t>
+        <w:t xml:space="preserve">Where the margin fails (GNPy over CORONET-CONUS). Per-service false-clear</w:t>
+      </w:r>
+      <w:r>
+        <w:t xml:space="preserve"> </w:t>
+      </w:r>
+      <w:r>
+        <w:t xml:space="preserve">over spectral position and reach concentrates on threshold-adjacent services. A</w:t>
+      </w:r>
+      <w:r>
+        <w:t xml:space="preserve"> </w:t>
+      </w:r>
+      <w:r>
+        <w:t xml:space="preserve">footprint-aware certificate removes it. Marker shape distinguishes classes.</w:t>
       </w:r>
     </w:p>
     <w:bookmarkEnd w:id="19"/>
@@ -1135,41 +846,22 @@
         <w:pStyle w:val="FirstParagraph"/>
       </w:pPr>
       <w:r>
-        <w:t xml:space="preserve">Because the risk is driven by the fill</w:t>
-      </w:r>
-      <w:r>
-        <w:t xml:space="preserve"> </w:t>
-      </w:r>
-      <w:r>
-        <w:rPr>
-          <w:i/>
-          <w:iCs/>
-        </w:rPr>
-        <w:t xml:space="preserve">increment</w:t>
-      </w:r>
-      <w:r>
-        <w:t xml:space="preserve"> </w:t>
-      </w:r>
-      <w:r>
-        <w:t xml:space="preserve">between provisioning and use,</w:t>
-      </w:r>
-      <w:r>
-        <w:t xml:space="preserve"> </w:t>
-      </w:r>
-      <w:r>
-        <w:t xml:space="preserve">a certificate has a refresh horizon. Sweeping the deployed fill from 6 to 76</w:t>
-      </w:r>
-      <w:r>
-        <w:t xml:space="preserve"> </w:t>
-      </w:r>
-      <w:r>
-        <w:t xml:space="preserve">channels, the naive false-clear rises approximately linearly with the number of added</w:t>
-      </w:r>
-      <w:r>
-        <w:t xml:space="preserve"> </w:t>
-      </w:r>
-      <w:r>
-        <w:t xml:space="preserve">channels (</w:t>
+        <w:t xml:space="preserve">The risk is driven by the fill added between provisioning and use, so a certificate</w:t>
+      </w:r>
+      <w:r>
+        <w:t xml:space="preserve"> </w:t>
+      </w:r>
+      <w:r>
+        <w:t xml:space="preserve">has a refresh horizon. Sweeping the deployed fill from 6 to 76 channels, the naive</w:t>
+      </w:r>
+      <w:r>
+        <w:t xml:space="preserve"> </w:t>
+      </w:r>
+      <w:r>
+        <w:t xml:space="preserve">false-clear rises roughly linearly with the number of added channels,</w:t>
+      </w:r>
+      <w:r>
+        <w:t xml:space="preserve"> </w:t>
       </w:r>
       <m:oMath>
         <m:r>
@@ -1207,7 +899,10 @@
         </m:r>
       </m:oMath>
       <w:r>
-        <w:t xml:space="preserve">,</w:t>
+        <w:t xml:space="preserve"> </w:t>
+      </w:r>
+      <w:r>
+        <w:t xml:space="preserve">with</w:t>
       </w:r>
       <w:r>
         <w:t xml:space="preserve"> </w:t>
@@ -1236,53 +931,33 @@
         </m:r>
       </m:oMath>
       <w:r>
-        <w:t xml:space="preserve">); at a 0.05 target the</w:t>
-      </w:r>
-      <w:r>
-        <w:t xml:space="preserve"> </w:t>
-      </w:r>
-      <w:r>
-        <w:t xml:space="preserve">refresh floor is</w:t>
+        <w:t xml:space="preserve">. At a</w:t>
       </w:r>
       <w:r>
         <w:t xml:space="preserve"> </w:t>
       </w:r>
       <m:oMath>
         <m:r>
-          <m:rPr>
-            <m:sty m:val="p"/>
-          </m:rPr>
-          <m:t>≈</m:t>
-        </m:r>
-        <m:r>
-          <m:t>8</m:t>
+          <m:t>0.05</m:t>
         </m:r>
       </m:oMath>
       <w:r>
         <w:t xml:space="preserve"> </w:t>
       </w:r>
       <w:r>
-        <w:t xml:space="preserve">added channels. The rule is concrete: re-certify a</w:t>
-      </w:r>
-      <w:r>
-        <w:t xml:space="preserve"> </w:t>
-      </w:r>
-      <w:r>
-        <w:t xml:space="preserve">service before the band around it grows by</w:t>
-      </w:r>
-      <w:r>
-        <w:t xml:space="preserve"> </w:t>
-      </w:r>
-      <m:oMath>
-        <m:r>
-          <m:rPr>
-            <m:sty m:val="p"/>
-          </m:rPr>
-          <m:t>∼</m:t>
-        </m:r>
-      </m:oMath>
-      <w:r>
-        <w:t xml:space="preserve">8 channels, not on a fixed calendar.</w:t>
+        <w:t xml:space="preserve">target the floor is</w:t>
+      </w:r>
+      <w:r>
+        <w:t xml:space="preserve"> </w:t>
+      </w:r>
+      <w:r>
+        <w:t xml:space="preserve">about 8 added channels. The rule is concrete. Re-certify a service before the band</w:t>
+      </w:r>
+      <w:r>
+        <w:t xml:space="preserve"> </w:t>
+      </w:r>
+      <w:r>
+        <w:t xml:space="preserve">around it grows by about 8 channels, rather than on a fixed calendar.</w:t>
       </w:r>
     </w:p>
     <w:bookmarkEnd w:id="21"/>
@@ -1301,7 +976,7 @@
         <w:pStyle w:val="FirstParagraph"/>
       </w:pPr>
       <w:r>
-        <w:t xml:space="preserve">QoT estimation and physical-layer-aware routing/spectrum assignment are</w:t>
+        <w:t xml:space="preserve">QoT estimation and physical-layer-aware routing and spectrum assignment are</w:t>
       </w:r>
       <w:r>
         <w:t xml:space="preserve"> </w:t>
@@ -1310,54 +985,34 @@
         <w:t xml:space="preserve">mature </w:t>
       </w:r>
       <w:r>
-        <w:t xml:space="preserve">; ML-QoT is active, with estimators trained predominantly</w:t>
-      </w:r>
-      <w:r>
-        <w:t xml:space="preserve"> </w:t>
-      </w:r>
-      <w:r>
-        <w:t xml:space="preserve">on prediction error </w:t>
-      </w:r>
-      <w:r>
-        <w:t xml:space="preserve">. Our contribution is orthogonal: not a better</w:t>
-      </w:r>
-      <w:r>
-        <w:t xml:space="preserve"> </w:t>
-      </w:r>
-      <w:r>
-        <w:t xml:space="preserve">estimator or allocator, but a</w:t>
-      </w:r>
-      <w:r>
-        <w:t xml:space="preserve"> </w:t>
-      </w:r>
-      <w:r>
-        <w:rPr>
-          <w:i/>
-          <w:iCs/>
-        </w:rPr>
-        <w:t xml:space="preserve">measurement</w:t>
-      </w:r>
-      <w:r>
-        <w:t xml:space="preserve">—the false-clear rate as a</w:t>
-      </w:r>
-      <w:r>
-        <w:t xml:space="preserve"> </w:t>
-      </w:r>
-      <w:r>
-        <w:t xml:space="preserve">first-class, consumer-relative KPI—and the finding that the ML-QoT training</w:t>
-      </w:r>
-      <w:r>
-        <w:t xml:space="preserve"> </w:t>
-      </w:r>
-      <w:r>
-        <w:rPr>
-          <w:i/>
-          <w:iCs/>
-        </w:rPr>
-        <w:t xml:space="preserve">objective</w:t>
-      </w:r>
-      <w:r>
-        <w:t xml:space="preserve">, and the margin allocation, should target the consumer’s threshold.</w:t>
+        <w:t xml:space="preserve">. ML-QoT is active, and its estimators are trained mostly on</w:t>
+      </w:r>
+      <w:r>
+        <w:t xml:space="preserve"> </w:t>
+      </w:r>
+      <w:r>
+        <w:t xml:space="preserve">prediction error </w:t>
+      </w:r>
+      <w:r>
+        <w:t xml:space="preserve">. We do not offer a better estimator or allocator. We</w:t>
+      </w:r>
+      <w:r>
+        <w:t xml:space="preserve"> </w:t>
+      </w:r>
+      <w:r>
+        <w:t xml:space="preserve">offer the measurement, the false-clear rate read against the consumer, and the finding</w:t>
+      </w:r>
+      <w:r>
+        <w:t xml:space="preserve"> </w:t>
+      </w:r>
+      <w:r>
+        <w:t xml:space="preserve">that both the ML-QoT training objective and the margin allocation should target the</w:t>
+      </w:r>
+      <w:r>
+        <w:t xml:space="preserve"> </w:t>
+      </w:r>
+      <w:r>
+        <w:t xml:space="preserve">decoder’s threshold.</w:t>
       </w:r>
     </w:p>
     <w:bookmarkEnd w:id="23"/>
@@ -1375,40 +1030,46 @@
         <w:pStyle w:val="FirstParagraph"/>
       </w:pPr>
       <w:r>
-        <w:t xml:space="preserve">Train QoT models, and size QoT margin, for the decision the FEC decoder makes, not for</w:t>
-      </w:r>
-      <w:r>
-        <w:t xml:space="preserve"> </w:t>
-      </w:r>
-      <w:r>
-        <w:t xml:space="preserve">average fidelity. The GN model is the evidence rung; a coherent-receiver pre-FEC-BER</w:t>
-      </w:r>
-      <w:r>
-        <w:t xml:space="preserve"> </w:t>
-      </w:r>
-      <w:r>
-        <w:t xml:space="preserve">witness on a fibre testbed, and the EGN/split-step model, are the external-validity</w:t>
-      </w:r>
-      <w:r>
-        <w:t xml:space="preserve"> </w:t>
-      </w:r>
-      <w:r>
-        <w:t xml:space="preserve">graduations. (The consumer-relative, false-clear methodology is not</w:t>
-      </w:r>
-      <w:r>
-        <w:t xml:space="preserve"> </w:t>
-      </w:r>
-      <w:r>
-        <w:t xml:space="preserve">optics-specific </w:t>
-      </w:r>
-      <w:r>
-        <w:t xml:space="preserve">, but the results here stand on the optical QoT</w:t>
-      </w:r>
-      <w:r>
-        <w:t xml:space="preserve"> </w:t>
-      </w:r>
-      <w:r>
-        <w:t xml:space="preserve">certificate alone.)</w:t>
+        <w:t xml:space="preserve">Train QoT models, and size QoT margin, for the decision the FEC decoder makes rather</w:t>
+      </w:r>
+      <w:r>
+        <w:t xml:space="preserve"> </w:t>
+      </w:r>
+      <w:r>
+        <w:t xml:space="preserve">than for average fidelity. The evidence stands on the GN model. A coherent-receiver</w:t>
+      </w:r>
+      <w:r>
+        <w:t xml:space="preserve"> </w:t>
+      </w:r>
+      <w:r>
+        <w:t xml:space="preserve">pre-FEC-BER witness on a fibre testbed, and the EGN or split-step model, are the</w:t>
+      </w:r>
+      <w:r>
+        <w:t xml:space="preserve"> </w:t>
+      </w:r>
+      <w:r>
+        <w:t xml:space="preserve">natural next steps. The method is not specific to optics. The same consumer-relative</w:t>
+      </w:r>
+      <w:r>
+        <w:t xml:space="preserve"> </w:t>
+      </w:r>
+      <w:r>
+        <w:t xml:space="preserve">false-clear appears in radio link adaptation and in database</w:t>
+      </w:r>
+      <w:r>
+        <w:t xml:space="preserve"> </w:t>
+      </w:r>
+      <w:r>
+        <w:t xml:space="preserve">replication </w:t>
+      </w:r>
+      <w:r>
+        <w:t xml:space="preserve">. The results here stand on the optical QoT certificate</w:t>
+      </w:r>
+      <w:r>
+        <w:t xml:space="preserve"> </w:t>
+      </w:r>
+      <w:r>
+        <w:t xml:space="preserve">alone.</w:t>
       </w:r>
     </w:p>
     <w:p>

</xml_diff>

<commit_message>
Style pass on both flip sections (plain declarative voice)
Split the clause-stacked control sentences ('We ran the same protocol on two FEC
classes. Their thresholds differ by a shift, but they read the same projection of
the network state, and no inversion appears.'), fixed the awkward WCNC abstract
sentence ('one user fleet does better under one policy and the other fleet under
the other'), dropped 'KPI', simplified the OFC intro flip sentence. GRADED-SWAP
marks untouched. All four outputs rebuilt (wcnc 4 pp, preview 3 pp); zero prose
em-dashes in both papers.

Co-Authored-By: Claude Opus 4.8 <noreply@anthropic.com>
</commit_message>
<xml_diff>
--- a/paper/ofc-qot/build/ofc-qot-preview.docx
+++ b/paper/ofc-qot/build/ofc-qot-preview.docx
@@ -197,31 +197,31 @@
         <w:t xml:space="preserve"> </w:t>
       </w:r>
       <w:r>
-        <w:t xml:space="preserve">capacity over a uniform margin. Two margin policies with equal budgets can receive</w:t>
-      </w:r>
-      <w:r>
-        <w:t xml:space="preserve"> </w:t>
-      </w:r>
-      <w:r>
-        <w:t xml:space="preserve">opposite verdicts from two service classes, so a fleet-level number can serve</w:t>
-      </w:r>
-      <w:r>
-        <w:t xml:space="preserve"> </w:t>
-      </w:r>
-      <w:r>
-        <w:t xml:space="preserve">neither. And when the twin’s QoT model is a learned surrogate, training it on</w:t>
-      </w:r>
-      <w:r>
-        <w:t xml:space="preserve"> </w:t>
-      </w:r>
-      <w:r>
-        <w:t xml:space="preserve">average error leaves it blind exactly at the FEC threshold where its decisions are</w:t>
-      </w:r>
-      <w:r>
-        <w:t xml:space="preserve"> </w:t>
-      </w:r>
-      <w:r>
-        <w:t xml:space="preserve">made.</w:t>
+        <w:t xml:space="preserve">capacity over a uniform margin. With equal margin budgets, one service class does</w:t>
+      </w:r>
+      <w:r>
+        <w:t xml:space="preserve"> </w:t>
+      </w:r>
+      <w:r>
+        <w:t xml:space="preserve">better under one allocation policy and the other class under the other, so a</w:t>
+      </w:r>
+      <w:r>
+        <w:t xml:space="preserve"> </w:t>
+      </w:r>
+      <w:r>
+        <w:t xml:space="preserve">fleet-level number serves neither. And when the twin’s QoT model is a learned</w:t>
+      </w:r>
+      <w:r>
+        <w:t xml:space="preserve"> </w:t>
+      </w:r>
+      <w:r>
+        <w:t xml:space="preserve">surrogate, training it on average error leaves it blind exactly at the FEC threshold</w:t>
+      </w:r>
+      <w:r>
+        <w:t xml:space="preserve"> </w:t>
+      </w:r>
+      <w:r>
+        <w:t xml:space="preserve">where its decisions are made.</w:t>
       </w:r>
     </w:p>
     <w:bookmarkEnd w:id="9"/>
@@ -928,43 +928,43 @@
         <w:t xml:space="preserve"> </w:t>
       </w:r>
       <w:r>
-        <w:t xml:space="preserve">cannot arbitrate: it prefers A overall while B is much better for half the fleet. A</w:t>
-      </w:r>
-      <w:r>
-        <w:t xml:space="preserve"> </w:t>
-      </w:r>
-      <w:r>
-        <w:t xml:space="preserve">control makes the mechanism sharp. Running the same protocol on two FEC classes,</w:t>
-      </w:r>
-      <w:r>
-        <w:t xml:space="preserve"> </w:t>
-      </w:r>
-      <w:r>
-        <w:t xml:space="preserve">whose thresholds differ by a shift but whose reads are the same projection of the</w:t>
-      </w:r>
-      <w:r>
-        <w:t xml:space="preserve"> </w:t>
-      </w:r>
-      <w:r>
-        <w:t xml:space="preserve">network state, produces no inversion at all. The inversion needs consumers that read</w:t>
-      </w:r>
-      <w:r>
-        <w:t xml:space="preserve"> </w:t>
-      </w:r>
-      <w:r>
-        <w:t xml:space="preserve">different axes of the state, here reach against spectral position, and that is</w:t>
-      </w:r>
-      <w:r>
-        <w:t xml:space="preserve"> </w:t>
-      </w:r>
-      <w:r>
-        <w:t xml:space="preserve">exactly what mixed service portfolios do. A twin that reports one fleet-level number</w:t>
-      </w:r>
-      <w:r>
-        <w:t xml:space="preserve"> </w:t>
-      </w:r>
-      <w:r>
-        <w:t xml:space="preserve">answers a question no consumer asked.</w:t>
+        <w:t xml:space="preserve">cannot arbitrate. It prefers A overall while B is much better for half the fleet. A</w:t>
+      </w:r>
+      <w:r>
+        <w:t xml:space="preserve"> </w:t>
+      </w:r>
+      <w:r>
+        <w:t xml:space="preserve">control makes the mechanism sharp. We ran the same protocol on two FEC classes.</w:t>
+      </w:r>
+      <w:r>
+        <w:t xml:space="preserve"> </w:t>
+      </w:r>
+      <w:r>
+        <w:t xml:space="preserve">Their thresholds differ by a shift, but they read the same projection of the network</w:t>
+      </w:r>
+      <w:r>
+        <w:t xml:space="preserve"> </w:t>
+      </w:r>
+      <w:r>
+        <w:t xml:space="preserve">state, and no inversion appears. The inversion needs consumers that read different</w:t>
+      </w:r>
+      <w:r>
+        <w:t xml:space="preserve"> </w:t>
+      </w:r>
+      <w:r>
+        <w:t xml:space="preserve">axes of the state, here reach against spectral position, and that is exactly what</w:t>
+      </w:r>
+      <w:r>
+        <w:t xml:space="preserve"> </w:t>
+      </w:r>
+      <w:r>
+        <w:t xml:space="preserve">mixed service portfolios do. A twin that reports one fleet-level number answers a</w:t>
+      </w:r>
+      <w:r>
+        <w:t xml:space="preserve"> </w:t>
+      </w:r>
+      <w:r>
+        <w:t xml:space="preserve">question no consumer asked.</w:t>
       </w:r>
     </w:p>
     <w:bookmarkEnd w:id="17"/>

</xml_diff>